<commit_message>
Caso de Uso 4
</commit_message>
<xml_diff>
--- a/documentacion/CU - Inicio de Sesión.docx
+++ b/documentacion/CU - Inicio de Sesión.docx
@@ -428,23 +428,30 @@
           <w:color w:val="000000"/>
           <w:lang w:val="es-GT"/>
         </w:rPr>
-        <w:t>-El sistema valida las credenciales ingresadas. (RN02, FA01)</w:t>
+        <w:t>-El sistema muestra el menú principal de opciones disponibles según el rol del usuario.</w:t>
       </w:r>
-    </w:p>
-    <w:p>
-      <w:pPr>
-        <w:spacing w:after="50"/>
-        <w:rPr>
-          <w:color w:val="000000"/>
-          <w:lang w:val="es-GT"/>
-        </w:rPr>
-      </w:pPr>
       <w:r>
         <w:rPr>
           <w:color w:val="000000"/>
           <w:lang w:val="es-GT"/>
         </w:rPr>
-        <w:t>-El sistema muestra el menú principal de opciones disponibles según el rol del usuario.</w:t>
+        <w:t xml:space="preserve"> </w:t>
+      </w:r>
+      <w:proofErr w:type="gramStart"/>
+      <w:r>
+        <w:rPr>
+          <w:color w:val="000000"/>
+          <w:lang w:val="es-GT"/>
+        </w:rPr>
+        <w:t>(</w:t>
+      </w:r>
+      <w:proofErr w:type="gramEnd"/>
+      <w:r>
+        <w:rPr>
+          <w:color w:val="000000"/>
+          <w:lang w:val="es-GT"/>
+        </w:rPr>
+        <w:t>FA01)</w:t>
       </w:r>
     </w:p>
     <w:p>
@@ -670,7 +677,6 @@
           <w:szCs w:val="21"/>
           <w:lang w:val="es-GT"/>
         </w:rPr>
-        <w:lastRenderedPageBreak/>
         <w:t>El sistema envía un código de verificación al correo del usuario.</w:t>
       </w:r>
     </w:p>
@@ -692,6 +698,7 @@
           <w:szCs w:val="21"/>
           <w:lang w:val="es-GT"/>
         </w:rPr>
+        <w:lastRenderedPageBreak/>
         <w:t>El sistema muestra el siguiente campo: Código de verificación.</w:t>
       </w:r>
     </w:p>

</xml_diff>

<commit_message>
Impletados componentes de catalogo
</commit_message>
<xml_diff>
--- a/documentacion/CU - Inicio de Sesión.docx
+++ b/documentacion/CU - Inicio de Sesión.docx
@@ -253,7 +253,14 @@
           <w:color w:val="000000"/>
           <w:lang w:val="es-GT"/>
         </w:rPr>
-        <w:t>-El usuario ingresa al portal del Sistema de Gestión de Quejas.</w:t>
+        <w:t xml:space="preserve">1. </w:t>
+      </w:r>
+      <w:r>
+        <w:rPr>
+          <w:color w:val="000000"/>
+          <w:lang w:val="es-GT"/>
+        </w:rPr>
+        <w:t>El usuario ingresa al portal del Sistema de Gestión de Quejas.</w:t>
       </w:r>
     </w:p>
     <w:p>
@@ -269,7 +276,14 @@
           <w:color w:val="000000"/>
           <w:lang w:val="es-GT"/>
         </w:rPr>
-        <w:t>-El sistema muestra la pantalla de inicio de sesión con los siguientes campos y opciones: (RN01)</w:t>
+        <w:t xml:space="preserve">2. </w:t>
+      </w:r>
+      <w:r>
+        <w:rPr>
+          <w:color w:val="000000"/>
+          <w:lang w:val="es-GT"/>
+        </w:rPr>
+        <w:t>El sistema muestra la pantalla de inicio de sesión con los siguientes campos y opciones: (RN01)</w:t>
       </w:r>
     </w:p>
     <w:p>
@@ -380,7 +394,14 @@
           <w:color w:val="000000"/>
           <w:lang w:val="es-GT"/>
         </w:rPr>
-        <w:t>-El usuario ingresa su correo electrónico.</w:t>
+        <w:t xml:space="preserve">3. </w:t>
+      </w:r>
+      <w:r>
+        <w:rPr>
+          <w:color w:val="000000"/>
+          <w:lang w:val="es-GT"/>
+        </w:rPr>
+        <w:t>El usuario ingresa su correo electrónico.</w:t>
       </w:r>
     </w:p>
     <w:p>
@@ -396,7 +417,14 @@
           <w:color w:val="000000"/>
           <w:lang w:val="es-GT"/>
         </w:rPr>
-        <w:t>-El usuario ingresa su contraseña.</w:t>
+        <w:t xml:space="preserve">4. </w:t>
+      </w:r>
+      <w:r>
+        <w:rPr>
+          <w:color w:val="000000"/>
+          <w:lang w:val="es-GT"/>
+        </w:rPr>
+        <w:t>El usuario ingresa su contraseña.</w:t>
       </w:r>
     </w:p>
     <w:p>
@@ -412,7 +440,14 @@
           <w:color w:val="000000"/>
           <w:lang w:val="es-GT"/>
         </w:rPr>
-        <w:t>-El usuario presiona el botón Iniciar Sesión. (FA04)</w:t>
+        <w:t xml:space="preserve">5. </w:t>
+      </w:r>
+      <w:r>
+        <w:rPr>
+          <w:color w:val="000000"/>
+          <w:lang w:val="es-GT"/>
+        </w:rPr>
+        <w:t>El usuario presiona el botón Iniciar Sesión. (FA04)</w:t>
       </w:r>
     </w:p>
     <w:p>
@@ -428,16 +463,22 @@
           <w:color w:val="000000"/>
           <w:lang w:val="es-GT"/>
         </w:rPr>
-        <w:t>-El sistema muestra el menú principal de opciones disponibles según el rol del usuario.</w:t>
+        <w:t xml:space="preserve">6. </w:t>
       </w:r>
       <w:r>
         <w:rPr>
           <w:color w:val="000000"/>
           <w:lang w:val="es-GT"/>
         </w:rPr>
+        <w:t>El sistema muestra el menú principal de opciones disponibles según el rol del usuario.</w:t>
+      </w:r>
+      <w:r>
+        <w:rPr>
+          <w:color w:val="000000"/>
+          <w:lang w:val="es-GT"/>
+        </w:rPr>
         <w:t xml:space="preserve"> </w:t>
       </w:r>
-      <w:proofErr w:type="gramStart"/>
       <w:r>
         <w:rPr>
           <w:color w:val="000000"/>
@@ -445,7 +486,6 @@
         </w:rPr>
         <w:t>(</w:t>
       </w:r>
-      <w:proofErr w:type="gramEnd"/>
       <w:r>
         <w:rPr>
           <w:color w:val="000000"/>
@@ -677,6 +717,7 @@
           <w:szCs w:val="21"/>
           <w:lang w:val="es-GT"/>
         </w:rPr>
+        <w:lastRenderedPageBreak/>
         <w:t>El sistema envía un código de verificación al correo del usuario.</w:t>
       </w:r>
     </w:p>
@@ -698,7 +739,6 @@
           <w:szCs w:val="21"/>
           <w:lang w:val="es-GT"/>
         </w:rPr>
-        <w:lastRenderedPageBreak/>
         <w:t>El sistema muestra el siguiente campo: Código de verificación.</w:t>
       </w:r>
     </w:p>

</xml_diff>